<commit_message>
Add .gitignore file to exclude environment files, logs, and editor configurations. Update document dates in business overview and technical documentation. Add new controller for activity logs and sessions, enhancing API functionality. Implement new routes for Power House analytics and activity tracking. Update package.json and package-lock.json for project name consistency and add documentation scripts. Clean up unused backlog data files.
</commit_message>
<xml_diff>
--- a/Admin_Audit_Log_Business_Overview.docx
+++ b/Admin_Audit_Log_Business_Overview.docx
@@ -45,7 +45,7 @@
           <w:szCs w:val="18"/>
           <w:rFonts w:ascii="Calibri" w:cs="Calibri" w:eastAsia="Calibri" w:hAnsi="Calibri"/>
         </w:rPr>
-        <w:t xml:space="preserve">Date: 31 July 2026</w:t>
+        <w:t xml:space="preserve">Date: 05 August 2026</w:t>
       </w:r>
     </w:p>
     <w:p>
@@ -1065,7 +1065,7 @@
                 <w:szCs w:val="18"/>
                 <w:rFonts w:ascii="Calibri" w:cs="Calibri" w:eastAsia="Calibri" w:hAnsi="Calibri"/>
               </w:rPr>
-              <w:t xml:space="preserve">Designed — to be built</w:t>
+              <w:t xml:space="preserve">Live</w:t>
             </w:r>
           </w:p>
         </w:tc>
@@ -1119,7 +1119,7 @@
                 <w:szCs w:val="18"/>
                 <w:rFonts w:ascii="Calibri" w:cs="Calibri" w:eastAsia="Calibri" w:hAnsi="Calibri"/>
               </w:rPr>
-              <w:t xml:space="preserve">Designed — to be built</w:t>
+              <w:t xml:space="preserve">Live</w:t>
             </w:r>
           </w:p>
         </w:tc>
@@ -1175,7 +1175,7 @@
                 <w:szCs w:val="18"/>
                 <w:rFonts w:ascii="Calibri" w:cs="Calibri" w:eastAsia="Calibri" w:hAnsi="Calibri"/>
               </w:rPr>
-              <w:t xml:space="preserve">Designed — to be built</w:t>
+              <w:t xml:space="preserve">Live</w:t>
             </w:r>
           </w:p>
         </w:tc>

</xml_diff>